<commit_message>
Update project files and notebooks
- Added `_just_for_me.ipynb` to .gitignore.
- Updated meeting notes with considerations for funicular schedules.
- Added operational status check for FM in data comprobations document.
- Enhanced ideas document with data source information and weight calculation method.
- Added compiled Python bytecode for `__init__.py` in data_comprovations.
- Refactored import paths in `data_comprovations.ipynb` for better project structure.
- Updated `from_txt_to_xlsx.ipynb` to correct conversion mode print statement.
</commit_message>
<xml_diff>
--- a/.meetings/02.06.docx
+++ b/.meetings/02.06.docx
@@ -964,6 +964,71 @@
       <w:pPr>
         <w:rPr>
           <w:rFonts w:ascii="Arial" w:hAnsi="Arial" w:cs="Arial"/>
+          <w:b/>
+          <w:bCs/>
+          <w:sz w:val="28"/>
+          <w:szCs w:val="28"/>
+        </w:rPr>
+      </w:pPr>
+      <w:r>
+        <w:rPr>
+          <w:rFonts w:ascii="Arial" w:hAnsi="Arial" w:cs="Arial"/>
+          <w:b/>
+          <w:bCs/>
+          <w:sz w:val="28"/>
+          <w:szCs w:val="28"/>
+        </w:rPr>
+        <w:t>A TENIR EN COMPTE:</w:t>
+      </w:r>
+    </w:p>
+    <w:p>
+      <w:pPr>
+        <w:rPr>
+          <w:rFonts w:ascii="Arial" w:hAnsi="Arial" w:cs="Arial"/>
+          <w:sz w:val="24"/>
+          <w:szCs w:val="24"/>
+        </w:rPr>
+      </w:pPr>
+      <w:r>
+        <w:rPr>
+          <w:rFonts w:ascii="Arial" w:hAnsi="Arial" w:cs="Arial"/>
+          <w:sz w:val="24"/>
+          <w:szCs w:val="24"/>
+        </w:rPr>
+        <w:t>Pel funicular els horaris no són significatius. Només hi ha un “</w:t>
+      </w:r>
+      <w:proofErr w:type="spellStart"/>
+      <w:r>
+        <w:rPr>
+          <w:rFonts w:ascii="Arial" w:hAnsi="Arial" w:cs="Arial"/>
+          <w:sz w:val="24"/>
+          <w:szCs w:val="24"/>
+        </w:rPr>
+        <w:t>trip_id</w:t>
+      </w:r>
+      <w:proofErr w:type="spellEnd"/>
+      <w:r>
+        <w:rPr>
+          <w:rFonts w:ascii="Arial" w:hAnsi="Arial" w:cs="Arial"/>
+          <w:sz w:val="24"/>
+          <w:szCs w:val="24"/>
+        </w:rPr>
+        <w:t>” per cada sentit i posa que surt a les 00:00:00 (sí que podem agafar el temps entre parades).</w:t>
+      </w:r>
+    </w:p>
+    <w:p>
+      <w:pPr>
+        <w:rPr>
+          <w:rFonts w:ascii="Arial" w:hAnsi="Arial" w:cs="Arial"/>
+          <w:sz w:val="24"/>
+          <w:szCs w:val="24"/>
+        </w:rPr>
+      </w:pPr>
+    </w:p>
+    <w:p>
+      <w:pPr>
+        <w:rPr>
+          <w:rFonts w:ascii="Arial" w:hAnsi="Arial" w:cs="Arial"/>
           <w:sz w:val="24"/>
           <w:szCs w:val="24"/>
         </w:rPr>
@@ -1262,6 +1327,7 @@
           <w:sz w:val="32"/>
           <w:szCs w:val="32"/>
         </w:rPr>
+        <w:lastRenderedPageBreak/>
         <w:t>OBJECTIU: AUTOBÚS</w:t>
       </w:r>
     </w:p>
@@ -1344,7 +1410,6 @@
           <w:sz w:val="32"/>
           <w:szCs w:val="32"/>
         </w:rPr>
-        <w:lastRenderedPageBreak/>
         <w:t>GENERAL</w:t>
       </w:r>
     </w:p>

</xml_diff>